<commit_message>
Hal12 Koreksi kolom wafaq 2×4 — 600,1209,18,27 / 6091,191,1200,618 kanan→kiri
Perbaiki penempatan angka dikolom yang salah: Baris1 | ٢٧ | ١٨ | ١٢٠٩ | ٦٠٠ | Baris2 | ٦١٨ | ١٢٠٠ | ١٩١ | ٦٠٩١ | — Gambar lama hal_12.png 3×3 salah diganti hal12_wafaq_corrected.png 2×4 300 DPI + tabel DOCX + preview koreksi. Latin tetap gaya baru qāthi'atu/Wafqul. Co-Authored-By: internal-model

Co-authored-by: arena-agent <297053741+arena-agent@users.noreply.github.com>
</commit_message>
<xml_diff>
--- a/REVISI_HAL12_FAIDAH_QATHIAH_WAFQ.docx
+++ b/REVISI_HAL12_FAIDAH_QATHIAH_WAFQ.docx
@@ -79,6 +79,19 @@
           <w:sz w:val="23"/>
         </w:rPr>
         <w:t>| ٢٧ | ١٨ | ١٢٠٩ | ٦٠٠ |</w:t>
+      </w:r>
+    </w:p>
+    <w:p>
+      <w:pPr>
+        <w:jc w:val="center"/>
+      </w:pPr>
+      <w:r>
+        <w:rPr>
+          <w:i/>
+          <w:color w:val="1B5E20"/>
+          <w:sz w:val="14"/>
+        </w:rPr>
+        <w:t>[Tabel Wafaq — Koreksi kolom — Kanan→Kiri: 600,1209,18,27 / 6091,191,1200,618]</w:t>
       </w:r>
     </w:p>
     <w:p>
@@ -286,9 +299,9 @@
         <w:t>Bentuk Rajah Angka Unik 2×4 jarang ditemukan — dirancang mengunci aura piring (shaḥn naqiyy). Kecepatan (sarī’atun-nafādz): kombinasi angka wafaq + 5 surat/ayat saat mahw 7× terbukti cepat menetralkan jin di syaraf dan melebur benteng penutup harta karun. Rajah angka tidak diterjemahkan — angka Arab ditulis apa adanya, arah penulisan dari kanan ke kiri.</w:t>
         <w:br/>
         <w:br/>
-        <w:t>![Wafaq Hal 12 — 2×4 ‘Adad — 8 angka](rajah_anwar_FINAL_300DPI/IMG_20261025_101416.jpg)</w:t>
+        <w:t>![Wafaq Hal 12 — 2×4 ‘Adad — 8 angka](hal12_wafaq_corrected.png)</w:t>
         <w:br/>
-        <w:t>[Gambar: Wafaq 2×4 — 600,1209,18,27 / 6091,191,1200,618 — FINAL 300 DPI]</w:t>
+        <w:t>[Gambar: Wafaq 2×4 — Koreksi kolom — 600,1209,18,27 / 6091,191,1200,618 — 300 DPI — sesuai teks]</w:t>
       </w:r>
     </w:p>
     <w:p>
@@ -298,7 +311,7 @@
       <w:r>
         <w:drawing>
           <wp:inline xmlns:a="http://schemas.openxmlformats.org/drawingml/2006/main" xmlns:pic="http://schemas.openxmlformats.org/drawingml/2006/picture">
-            <wp:extent cx="4389120" cy="3391593"/>
+            <wp:extent cx="4023360" cy="2011680"/>
             <wp:docPr id="1" name="Picture 1"/>
             <wp:cNvGraphicFramePr>
               <a:graphicFrameLocks noChangeAspect="1"/>
@@ -307,7 +320,7 @@
               <a:graphicData uri="http://schemas.openxmlformats.org/drawingml/2006/picture">
                 <pic:pic>
                   <pic:nvPicPr>
-                    <pic:cNvPr id="0" name="hal_12.png"/>
+                    <pic:cNvPr id="0" name="hal12_wafaq_corrected.png"/>
                     <pic:cNvPicPr/>
                   </pic:nvPicPr>
                   <pic:blipFill>
@@ -319,7 +332,7 @@
                   <pic:spPr>
                     <a:xfrm>
                       <a:off x="0" y="0"/>
-                      <a:ext cx="4389120" cy="3391593"/>
+                      <a:ext cx="4023360" cy="2011680"/>
                     </a:xfrm>
                     <a:prstGeom prst="rect"/>
                   </pic:spPr>
@@ -340,7 +353,7 @@
           <w:color w:val="666666"/>
           <w:sz w:val="14"/>
         </w:rPr>
-        <w:t>[Gambar: Hal 12 Asli — Wafaq angka — hal_12.png — 460KB]</w:t>
+        <w:t>[Gambar: Wafaq 2×4 Koreksi — 600,1209,18,27 / 6091,191,1200,618 — Kanan→Kiri — menggantikan hal_12.png 3×3 salah]</w:t>
       </w:r>
     </w:p>
     <w:tbl>
@@ -474,7 +487,68 @@
           <w:color w:val="6A1B9A"/>
           <w:sz w:val="14"/>
         </w:rPr>
-        <w:t>Catatan: Angka dalam gambar Hal12 asli (3×3) sedikit berbeda — teks di MD mengikuti penamaan kitab; gambar asli diprioritaskan</w:t>
+        <w:t>Tabel verifikasi DOCX — Kanan→Kiri: Baris1 kanan 600 → kiri 27, Baris2 kanan 6091 → kiri 618 — Koreksi kolom</w:t>
+      </w:r>
+    </w:p>
+    <w:p>
+      <w:r>
+        <w:rPr>
+          <w:i/>
+          <w:color w:val="C62828"/>
+          <w:sz w:val="14"/>
+        </w:rPr>
+        <w:t>Koreksi: Penempatan angka di kolom sebelumnya salah — telah diperbaiki sesuai teks: Baris1 | ٢٧ | ١٨ | ١٢٠٩ | ٦٠٠ | dan Baris2 | ٦١٨ | ١٢٠٠ | ١٩١ | ٦٠٩١ | — Gambar lama hal_12.png (3×3) diganti hal12_wafaq_corrected.png (2×4)</w:t>
+      </w:r>
+    </w:p>
+    <w:p>
+      <w:pPr>
+        <w:jc w:val="center"/>
+      </w:pPr>
+      <w:r>
+        <w:drawing>
+          <wp:inline xmlns:a="http://schemas.openxmlformats.org/drawingml/2006/main" xmlns:pic="http://schemas.openxmlformats.org/drawingml/2006/picture">
+            <wp:extent cx="2743200" cy="2119745"/>
+            <wp:docPr id="2" name="Picture 2"/>
+            <wp:cNvGraphicFramePr>
+              <a:graphicFrameLocks noChangeAspect="1"/>
+            </wp:cNvGraphicFramePr>
+            <a:graphic>
+              <a:graphicData uri="http://schemas.openxmlformats.org/drawingml/2006/picture">
+                <pic:pic>
+                  <pic:nvPicPr>
+                    <pic:cNvPr id="0" name="hal_12.png"/>
+                    <pic:cNvPicPr/>
+                  </pic:nvPicPr>
+                  <pic:blipFill>
+                    <a:blip r:embed="rId12"/>
+                    <a:stretch>
+                      <a:fillRect/>
+                    </a:stretch>
+                  </pic:blipFill>
+                  <pic:spPr>
+                    <a:xfrm>
+                      <a:off x="0" y="0"/>
+                      <a:ext cx="2743200" cy="2119745"/>
+                    </a:xfrm>
+                    <a:prstGeom prst="rect"/>
+                  </pic:spPr>
+                </pic:pic>
+              </a:graphicData>
+            </a:graphic>
+          </wp:inline>
+        </w:drawing>
+      </w:r>
+    </w:p>
+    <w:p>
+      <w:pPr>
+        <w:jc w:val="center"/>
+      </w:pPr>
+      <w:r>
+        <w:rPr>
+          <w:i/>
+          <w:sz w:val="12"/>
+        </w:rPr>
+        <w:t>[Gambar: Hal 12 Asli Lama — 3×3 — SALAH kolom — untuk perbandingan — diganti]</w:t>
       </w:r>
     </w:p>
     <w:sectPr>

</xml_diff>